<commit_message>
Complete APA 7 author lists and volume/issue details for Binz, Peng, Toubia references
Co-Authored-By: Claude Sonnet 5.5 <noreply@anthropic.com>
Claude-Session: https://claude.ai/code/session_01UvKcabfwJpaPKKhavR8Tdw
</commit_message>
<xml_diff>
--- a/submission_jim/02_Manuscript_blind.docx
+++ b/submission_jim/02_Manuscript_blind.docx
@@ -9812,7 +9812,7 @@
           <w:sz w:val="24"/>
           <w:szCs w:val="24"/>
         </w:rPr>
-        <w:t xml:space="preserve">Binz, M., Akata, E., Bethge, M., et al. (2025). A foundation model to predict and capture human cognition. </w:t>
+        <w:t xml:space="preserve">Binz, M., Akata, E., Bethge, M., Brändle, F., Callaway, F., Coda-Forno, J., Dayan, P., Demircan, C., Eckstein, M. K., Éltető, N., Griffiths, T. L., Haridi, S., Jagadish, A. K., Ji-An, L., Kipnis, A., Kumar, S., Ludwig, T., Mathony, M., Mattar, M., . . . Schulz, E. (2025). A foundation model to predict and capture human cognition. </w:t>
       </w:r>
       <w:r>
         <w:rPr>
@@ -9830,7 +9830,7 @@
           <w:sz w:val="24"/>
           <w:szCs w:val="24"/>
         </w:rPr>
-        <w:t xml:space="preserve">, 1002–1009. [Complete the author list as required by APA 7.]</w:t>
+        <w:t xml:space="preserve">(8078), 1002–1009. https://doi.org/10.1038/s41586-025-09215-4</w:t>
       </w:r>
     </w:p>
     <w:p>
@@ -10228,7 +10228,7 @@
           <w:sz w:val="24"/>
           <w:szCs w:val="24"/>
         </w:rPr>
-        <w:t xml:space="preserve">Peng, T., Gui, G., Brucks, M., et al. (2026). </w:t>
+        <w:t xml:space="preserve">Peng, T., Gui, G., Brucks, M., Merlau, D. J., Fan, G. J., Ben Sliman, M., Johnson, E. J., Althenayyan, A., Bellezza, S., Donati, D., Fong, H., Friedman, E., Guevara, A., Hussein, M., Jerath, K., Kogut, B., Kumar, A., Lane, K., Li, H., . . . Toubia, O. (2026). </w:t>
       </w:r>
       <w:r>
         <w:rPr>
@@ -10246,7 +10246,7 @@
           <w:sz w:val="24"/>
           <w:szCs w:val="24"/>
         </w:rPr>
-        <w:t xml:space="preserve"> (arXiv:2509.19088). arXiv. [Complete the author list as required by APA 7.]</w:t>
+        <w:t xml:space="preserve"> (arXiv:2509.19088). arXiv. https://arxiv.org/abs/2509.19088</w:t>
       </w:r>
     </w:p>
     <w:p>
@@ -10302,15 +10302,15 @@
           <w:sz w:val="24"/>
           <w:szCs w:val="24"/>
         </w:rPr>
-        <w:t xml:space="preserve">Marketing Science</w:t>
-      </w:r>
-      <w:r>
-        <w:rPr>
-          <w:rFonts w:ascii="Times New Roman" w:cs="Times New Roman" w:eastAsia="Times New Roman" w:hAnsi="Times New Roman"/>
-          <w:sz w:val="24"/>
-          <w:szCs w:val="24"/>
-        </w:rPr>
-        <w:t xml:space="preserve">. [Add volume, issue, pages.]</w:t>
+        <w:t xml:space="preserve">Marketing Science, 44</w:t>
+      </w:r>
+      <w:r>
+        <w:rPr>
+          <w:rFonts w:ascii="Times New Roman" w:cs="Times New Roman" w:eastAsia="Times New Roman" w:hAnsi="Times New Roman"/>
+          <w:sz w:val="24"/>
+          <w:szCs w:val="24"/>
+        </w:rPr>
+        <w:t xml:space="preserve">(6), 1446–1455. https://doi.org/10.1287/mksc.2025.0262</w:t>
       </w:r>
     </w:p>
     <w:p>

</xml_diff>

<commit_message>
Rewrite manuscript body for marketing audience: managerial framing, marketing literature, protocol, theory and future research
Co-Authored-By: Claude Sonnet 5.5 <noreply@anthropic.com>
Claude-Session: https://claude.ai/code/session_01UvKcabfwJpaPKKhavR8Tdw
</commit_message>
<xml_diff>
--- a/submission_jim/02_Manuscript_blind.docx
+++ b/submission_jim/02_Manuscript_blind.docx
@@ -103,7 +103,7 @@
           <w:sz w:val="24"/>
           <w:szCs w:val="24"/>
         </w:rPr>
-        <w:t xml:space="preserve">Digital platforms run experiments continuously: they test defaults in enrollment flows, price presentations, recommendation layouts, and headlines. Each experiment costs traffic, time, and sometimes user trust, and many candidate designs never reach a test. Large language models (LLMs) offer a tempting shortcut. A “digital twin” conditions a model on a person’s profile or past answers and asks how that person would respond (Argyle et al., 2023; Horton et al., 2023; Toubia et al., 2025). If twins behaved like users, a platform could screen thousands of designs before spending human traffic, and market researchers could run pilot studies at near-zero marginal cost, which is the promise behind recent work on GPT-based market research (Brand et al., 2024).</w:t>
+        <w:t xml:space="preserve">Marketers now learn about customers by running experiments continuously. A retailer tests whether a pre-checked loyalty enrollment box raises sign-ups, a subscription service tests price menus, a publisher tests headlines, and a platform tests how targeted advertising is perceived. Each test consumes customer traffic and time, and many promising designs never reach a test. Market researchers face the parallel problem of the cost and speed of surveys and conjoint studies. Large language models (LLMs) offer a tempting shortcut: synthetic consumers, also called silicon samples or digital twins, that answer experimental scenarios as if they were customers (Argyle et al., 2023; Brand et al., 2024; Sarstedt et al., 2024; Toubia et al., 2025). If such agents behaved like customers, a firm could screen thousands of designs before spending customer traffic, and researchers could pilot studies at near-zero marginal cost.</w:t>
       </w:r>
     </w:p>
     <w:p>
@@ -117,7 +117,7 @@
           <w:sz w:val="24"/>
           <w:szCs w:val="24"/>
         </w:rPr>
-        <w:t xml:space="preserve">Whether platforms should rely on such evidence is an open question with practical stakes. A pipeline that trusts synthetic agents where they fail will promote the wrong designs, and one that distrusts them everywhere forgoes a cheap screening tool. Existing evaluations do not settle the matter because they ask whether twins reproduce effects on average (Aher et al., 2023; Binz et al., 2025; Peng et al., 2026). The pipeline question is different. A designer must know, for a specific kind of effect and a specific model configuration, whether the twin’s output is informative about direction, informative about magnitude, or not informative at all, and must know how long that answer remains valid when the model changes.</w:t>
+        <w:t xml:space="preserve">Whether managers should rely on such evidence is an open question with practical stakes. A firm that trusts synthetic consumers where they fail will promote the wrong designs, and a firm that distrusts them everywhere forgoes a cheap screening tool. The marketing literature has begun to offer guidelines. Sarstedt et al. (2024) see promise for pretests and pilots but caution against replacing real respondents, and Stromberg et al. (2025) document blind spots as insights become more specific. The empirical evidence is thinner and mostly asks whether LLMs reproduce effects on average (Aher et al., 2023; Binz et al., 2025). Individual-level predictions of digital twins are weak and twins behave as hyper-rational agents (Peng et al., 2026), and recent studies of headline A/B tests find weak accuracy for LLM click prediction (Maiorano, 2026; Persson et al., 2026). What a manager needs is different: for a specific kind of effect and a specific model configuration, is the synthetic output informative about direction, informative about magnitude, or not informative at all, and how long does that answer remain valid when the model changes?</w:t>
       </w:r>
     </w:p>
     <w:p>
@@ -131,7 +131,7 @@
           <w:sz w:val="24"/>
           <w:szCs w:val="24"/>
         </w:rPr>
-        <w:t xml:space="preserve">This paper asks when a synthetic agent can be trusted in an experimentation pipeline, and answers with a validity-region account and a protocol for using it. We argue that a twin is informative about a treatment effect only inside a region defined by four conditions: the treatment operates through information carried by the text of the stimulus (V1), the effect is not mediated by effort or transaction costs that a text-only agent does not bear (V2), the paradigm is not memorized (V3), and the agent’s reasoning regime matches the human decision regime (V4). We derive seven propositions from the account and test them in a design that separates exploration from confirmation. Exploratory simulations generated the propositions. New simulated respondents, a new prompt template, a reasoning-effort by temperature grid, and 999 public headline A/B tests then tested them under pre-registrations that fixed predictions and decision rules before the data were generated. A further exploratory study varies the prompt template and the model generation within five model families.</w:t>
+        <w:t xml:space="preserve">This paper answers that question with a validity-region account and a protocol for using it. We argue that a synthetic consumer is informative about a treatment effect only if four conditions hold: the treatment operates through information that the consumer reads in the stimulus, namely wording, numbers, and option structure (V1); the effect is not mediated by effort or transaction costs that a text-only agent does not bear (V2); the paradigm is not memorized (V3); and the agent’s reasoning regime matches the consumer’s decision regime (V4). We test seven propositions derived from the account on five effects that are central to digital choice architecture: default enrollment, loss-framed messages, numerical anchors, decoy options in choice sets, and fairness perceptions of targeted advertising.</w:t>
       </w:r>
     </w:p>
     <w:p>
@@ -145,7 +145,7 @@
           <w:sz w:val="24"/>
           <w:szCs w:val="24"/>
         </w:rPr>
-        <w:t xml:space="preserve">The results support the account in part and reject it in part, and both are informative. Default effects reverse with paradigm familiarity in all five model families: twins overstate the canonical organ-donation default and understate a novel green-energy default that humans respond to strongly. Naming the phenomenon in the prompt inflates canonical effects. More reasoning reduces factual errors but increases cue-based bias, and the two do not move together. On field data, twin predictions of headline winners beat chance by about nine percentage points only when no persona is supplied, and they compress rather than inflate true effects. Across 13 model versions, prompt wording matters little, whereas each model has its own profile of errors and that profile changes between generations.</w:t>
+        <w:t xml:space="preserve">The design separates exploration from confirmation. Exploratory simulations generated the propositions. New simulated respondents, a new prompt template, a reasoning-effort by temperature grid, and 999 public headline A/B tests then tested them under pre-registrations that fixed predictions and decision rules before the data were generated. A further exploratory study varies the prompt template and model generation across 13 model versions in five families.</w:t>
       </w:r>
     </w:p>
     <w:p>
@@ -159,7 +159,7 @@
           <w:sz w:val="24"/>
           <w:szCs w:val="24"/>
         </w:rPr>
-        <w:t xml:space="preserve">The paper makes three contributions. First, it supplies a theory of validity regions for synthetic agents that is falsifiable, and it reports which parts survive confirmation, which is rare in a literature dominated by positive demonstrations. Second, it provides an empirical validity map across effect types, persona architectures, prompt templates, and model generations. Third, it translates the map into design knowledge: a validation protocol that tells platform teams what evidence they need before using synthetic agents, what the agents can and cannot do, and what to document so that synthetic evidence can be audited. These contributions speak to managers who run digital experiments, to the methodology of consumer and marketing research that uses synthetic respondents, and to governance of AI-mediated choice architectures.</w:t>
+        <w:t xml:space="preserve">The results support the account in part and reject it in part. Default effects reverse with paradigm familiarity in all five model families: synthetic consumers overstate the canonical organ-donation default and understate a novel green-energy default that human consumers respond to strongly. Naming the phenomenon in the prompt inflates canonical effects. More reasoning reduces factual errors but increases cue-based bias, and the two do not move together. In the field data, predictions of headline winners beat chance by about nine percentage points only without personas, and predicted effects are compressed to about a quarter of observed effects. Prompt wording matters little, whereas each model has its own profile of errors that changes between generations.</w:t>
       </w:r>
     </w:p>
     <w:p>
@@ -173,7 +173,7 @@
           <w:sz w:val="24"/>
           <w:szCs w:val="24"/>
         </w:rPr>
-        <w:t xml:space="preserve">Section 2 develops the account and the propositions. Section 3 describes the studies and the pre-registration structure. Section 4 reports results. Section 5 derives the decision protocol. Section 6 discusses implications and limitations.</w:t>
+        <w:t xml:space="preserve">The paper makes three contributions. First, it supplies a falsifiable account of when synthetic consumers are informative about consumer decision effects, and reports which parts survive confirmation, which is rare in a literature dominated by positive demonstrations. Second, it provides an empirical validity map across effect types, persona architectures, reasoning settings, prompt templates, and model generations. Third, it turns the map into a managerial protocol: what synthetic evidence can be used for, what must still be tested on people, and what to document so that synthetic evidence can be audited. Section 2 develops the account, Section 3 describes the studies, Section 4 reports results, Section 5 draws managerial implications, and Section 6 discusses theory, research practice, and limitations.</w:t>
       </w:r>
     </w:p>
     <w:p>
@@ -209,7 +209,7 @@
           <w:sz w:val="24"/>
           <w:szCs w:val="24"/>
         </w:rPr>
-        <w:t xml:space="preserve">2.1 Synthetic agents in experimentation pipelines</w:t>
+        <w:t xml:space="preserve">2.1 Synthetic consumers in marketing research and digital experimentation</w:t>
       </w:r>
     </w:p>
     <w:p>
@@ -223,7 +223,7 @@
           <w:sz w:val="24"/>
           <w:szCs w:val="24"/>
         </w:rPr>
-        <w:t xml:space="preserve">Digital experimentation is a measurement infrastructure for interactive marketing: it produces the evidence on which firms choose defaults, layouts, prices, and messages. Introducing synthetic agents adds a new instrument whose measurement properties are unknown. A good instrument has known validity conditions, known failure modes, and known stability over time. We therefore treat a twin as a measurement instrument and ask under which conditions its readings can be trusted. This framing differs from the common question of whether LLMs “think like humans,” which is not needed for the managerial decision and cannot be settled by behavioral output alone.</w:t>
+        <w:t xml:space="preserve">Digital experimentation is a measurement infrastructure for interactive marketing: it produces the evidence on which firms choose defaults, layouts, prices, and messages. Introducing synthetic consumers adds a new instrument whose measurement properties are unknown. A good instrument has known validity conditions, known failure modes, and known stability over time. We therefore treat a twin as a measurement instrument and ask under which conditions its readings can be trusted. This framing differs from the question of whether LLMs “think like humans,” which is not needed for the managerial decision and cannot be settled by behavioral output alone.</w:t>
       </w:r>
     </w:p>
     <w:p>
@@ -237,7 +237,7 @@
           <w:sz w:val="24"/>
           <w:szCs w:val="24"/>
         </w:rPr>
-        <w:t xml:space="preserve">Prior work establishes that LLMs can reproduce the direction of many classic effects (Aher et al., 2023; Horton et al., 2023), that fine-tuning on behavioral corpora improves prediction (Binz et al., 2025), and that individual-level twin predictions are weak and twins act as hyper-rational agents (Peng et al., 2026). Recent work argues that simulations should be validated against held-out human data because memorization and bias threaten validity (Hullman et al., 2026), and that behavioral fidelity does not by itself imply that twins can reduce the need for human measurement (Wang et al., 2026). Independent reports on the Upworthy archive find weak accuracy for LLM click prediction and that persona conditioning does not help (Maiorano, 2026; Persson et al., 2026; see Section 4.4). Our account is complementary: it specifies conditions on the effect and the agent that predict where validity should hold, and it tests those predictions.</w:t>
+        <w:t xml:space="preserve">Prior work gives a mixed picture. LLMs can reproduce the direction of many classic effects (Aher et al., 2023; Horton et al., 2023), generate plausible willingness-to-pay estimates in market research (Brand et al., 2024), and, when fine-tuned on behavioral corpora, predict held-out participants (Binz et al., 2025). Guidelines for silicon samples recommend them for pretests and hypothesis generation but not as a replacement for respondents (Sarstedt et al., 2024). At the same time, twins built from individual answers predict individuals weakly and act as hyper-rational agents (Peng et al., 2026), the specificity of the insights limits what silicon samples can deliver (Stromberg et al., 2025), and click-prediction studies on public A/B tests find weak accuracy and no benefit from personas (Maiorano, 2026; Persson et al., 2026). Recent work argues that simulations should be validated against held-out human data because memorization and bias threaten validity (Hullman et al., 2026) and that behavioral fidelity does not by itself imply that twins reduce the need for human measurement (Wang et al., 2026). Our account is complementary: it states conditions on the effect and the agent that predict where validity should hold, and it tests those predictions across effect types and model versions.</w:t>
       </w:r>
     </w:p>
     <w:p>
@@ -256,7 +256,7 @@
           <w:sz w:val="24"/>
           <w:szCs w:val="24"/>
         </w:rPr>
-        <w:t xml:space="preserve">2.2 Why LLM responses may or may not reproduce human effects</w:t>
+        <w:t xml:space="preserve">2.2 Consumer decision effects and why LLM responses may or may not reproduce them</w:t>
       </w:r>
     </w:p>
     <w:p>
@@ -270,7 +270,21 @@
           <w:sz w:val="24"/>
           <w:szCs w:val="24"/>
         </w:rPr>
-        <w:t xml:space="preserve">An LLM’s answer to a decision scenario is generated from three sources: retrieved regularities about how people respond in text, normative reasoning, and conditioning on the supplied persona. Human biases arise from additional processes that a text-only agent does not bear. Defaults work in part because acting costs effort and attention (Jachimowicz et al., 2019; Lieder &amp; Griffiths, 2020). Framing and anchoring work through cues in the wording and numbers of the stimulus (Kahneman &amp; Tversky, 1979; Tversky &amp; Kahneman, 1974). The attraction effect works through the structure of the option set (Huber et al., 1982). Fairness judgments reflect social preferences (Güth et al., 1982). Because training corpora contain many descriptions of the canonical experiments (Carlini et al., 2021, 2023), a model may reproduce a canonical effect by recall instead of by generalizing the mechanism. Reasoning budgets introduce a further regime: extended deliberation may increase normative responding, or it may elaborate cues in the stimulus and amplify cue-driven effects.</w:t>
+        <w:t xml:space="preserve">We study five effects because each corresponds to a design lever of digital choice architecture. Default effects shape enrollment, renewal, and privacy settings, and arise partly because acting against the default costs effort and attention (Jachimowicz et al., 2019; Lieder &amp; Griffiths, 2020). Loss framing is the basis of many promotional messages and works through the wording of the stimulus (Kahneman &amp; Tversky, 1979). Numerical anchors, such as list prices and reference prices, shift later judgments through the numbers a consumer reads (Tversky &amp; Kahneman, 1974). Decoy options, used in pricing menus and assortments, change choices through the structure of the option set (Huber et al., 1982). Fairness perceptions govern how consumers respond to targeting and differential pricing (Güth et al., 1982).</w:t>
+      </w:r>
+    </w:p>
+    <w:p>
+      <w:pPr>
+        <w:spacing w:line="480"/>
+        <w:ind w:firstLine="720"/>
+      </w:pPr>
+      <w:r>
+        <w:rPr>
+          <w:rFonts w:ascii="Times New Roman" w:cs="Times New Roman" w:eastAsia="Times New Roman" w:hAnsi="Times New Roman"/>
+          <w:sz w:val="24"/>
+          <w:szCs w:val="24"/>
+        </w:rPr>
+        <w:t xml:space="preserve">An LLM’s answer to a decision scenario is generated from three sources: retrieved regularities about how people respond in text, normative reasoning, and conditioning on the supplied persona. Human biases arise from additional processes that a text-only agent does not bear. Because training corpora contain many descriptions of the canonical experiments (Carlini et al., 2021, 2023), a model may reproduce a canonical effect by recall instead of by generalizing the mechanism. Reasoning budgets introduce a further regime: extended deliberation may increase normative responding, or it may elaborate the cues in the stimulus and amplify cue-driven effects.</w:t>
       </w:r>
     </w:p>
     <w:p>
@@ -303,7 +317,7 @@
           <w:sz w:val="24"/>
           <w:szCs w:val="24"/>
         </w:rPr>
-        <w:t xml:space="preserve">We define a twin as valid for a treatment effect, in the sense relevant to a pipeline, when its estimate of the effect falls inside the sampling uncertainty of the human effect (magnitude-valid) or has the same sign with confidence that excludes zero (direction-valid). The account says that validity is jointly governed by four conditions on the effect and the agent.</w:t>
+        <w:t xml:space="preserve">We define a twin as valid for a treatment effect, in the sense relevant to a marketing decision, when its estimate of the effect falls inside the sampling uncertainty of the human effect (magnitude-valid) or has the same sign with confidence that excludes zero (direction-valid). The account says that validity is jointly governed by four conditions on the effect and the agent.</w:t>
       </w:r>
     </w:p>
     <w:p>
@@ -2416,7 +2430,7 @@
           <w:sz w:val="24"/>
           <w:szCs w:val="24"/>
         </w:rPr>
-        <w:t xml:space="preserve">No new human data were collected. Human benchmarks come from two public datasets. Twin-2K-500 comprises 2,058 US panelists who completed four survey waves, including classic heuristics-and-biases items and a repeat wave (Toubia et al., 2025). The accompanying mega-study ran 19 new pre-registered human studies after the twins were built (Peng et al., 2026). We computed the human effects in Table 3 from the public responses, coding conditions from the displayed survey text. The raw condition tag in the targeting-fairness file is inverted relative to the text shown to participants, and we note this for the data providers. Simulated respondents are Twin-2K-500 participants. The exploratory studies used the 772 participants who appear in the three mega-study files, and the confirmatory studies used respondents who did not appear in any of those files or in earlier confirmatory samples.</w:t>
+        <w:t xml:space="preserve">No new human data were collected. Human benchmarks come from two public datasets. Twin-2K-500 comprises 2,058 US panelists who completed four survey waves, including classic heuristics-and-biases items and a repeat wave (Toubia et al., 2025). The accompanying mega-study ran 19 new pre-registered human studies after the twins were built (Peng et al., 2026). The paradigms map to marketing contexts: the organ-donation and green-energy items are enrollment defaults, the three choice sets (television, printer, phone) are price-menu decoys, the targeting-fairness item concerns demographically targeted advertising, and the framing and anchoring items are message and price cues. We computed the human effects in Table 3 from the public responses, coding conditions from the displayed survey text. The raw condition tag in the targeting-fairness file is inverted relative to the text shown to participants, and we note this for the data providers. Simulated respondents are Twin-2K-500 participants. The exploratory studies used the 772 participants who appear in the three mega-study files, and the confirmatory studies used respondents who did not appear in any of those files or in earlier confirmatory samples.</w:t>
       </w:r>
     </w:p>
     <w:p>
@@ -9416,7 +9430,7 @@
           <w:sz w:val="24"/>
           <w:szCs w:val="24"/>
         </w:rPr>
-        <w:t xml:space="preserve">The results imply a protocol with five steps for teams that consider synthetic agents in an experimentation pipeline. The protocol is a design proposition derived from the confirmatory and stability results and has not itself been tested in a deployed pipeline.</w:t>
+        <w:t xml:space="preserve">The results imply a protocol with five steps for managers and research teams that consider synthetic consumers in digital experimentation or market research. The protocol is a proposition derived from the confirmatory and stability results and has not been tested in a deployed pipeline.</w:t>
       </w:r>
     </w:p>
     <w:p>
@@ -9440,7 +9454,7 @@
           <w:sz w:val="24"/>
           <w:szCs w:val="24"/>
         </w:rPr>
-        <w:t xml:space="preserve"> Determine whether the planned treatment operates through textual cues (wording, numbers, option structure), through effort or transaction costs (defaults, inertia, friction), or through social preferences (fairness). Determine whether the paradigm resembles a canonical, widely documented experiment. </w:t>
+        <w:t xml:space="preserve"> Determine whether the planned treatment works through cues the consumer reads (wording, numbers, option structure), through effort or transaction costs (defaults, inertia, friction), or through fairness perceptions, and whether the paradigm resembles a widely documented experiment. </w:t>
       </w:r>
       <w:r>
         <w:rPr>
@@ -9450,15 +9464,33 @@
           <w:sz w:val="24"/>
           <w:szCs w:val="24"/>
         </w:rPr>
-        <w:t xml:space="preserve">Step 2, consult the validity map.</w:t>
-      </w:r>
-      <w:r>
-        <w:rPr>
-          <w:rFonts w:ascii="Times New Roman" w:cs="Times New Roman" w:eastAsia="Times New Roman" w:hAnsi="Times New Roman"/>
-          <w:sz w:val="24"/>
-          <w:szCs w:val="24"/>
-        </w:rPr>
-        <w:t xml:space="preserve"> For cue-based effects, synthetic agents have been direction-valid in most configurations and can be used to rank alternatives, but not to size effects. For cost-based effects, such as defaults, they should not be used, because direction was valid in only 15% of configurations and the sign changed with paradigm familiarity. Fairness effects are model-dependent.</w:t>
+        <w:t xml:space="preserve">Step 2, consult the validity map (Table 8).</w:t>
+      </w:r>
+      <w:r>
+        <w:rPr>
+          <w:rFonts w:ascii="Times New Roman" w:cs="Times New Roman" w:eastAsia="Times New Roman" w:hAnsi="Times New Roman"/>
+          <w:sz w:val="24"/>
+          <w:szCs w:val="24"/>
+        </w:rPr>
+        <w:t xml:space="preserve"> For cue-based changes, such as a price anchor, a loss-framed message, or a decoy in a price menu, synthetic consumers were direction-valid in most configurations and can be used to rank alternatives, but not to size effects. For cost-based design, such as enrollment defaults, they should not be used, because direction was valid in only 15% of configurations and the sign changed with paradigm familiarity. Fairness perceptions of targeting are model-dependent. </w:t>
+      </w:r>
+      <w:r>
+        <w:rPr>
+          <w:rFonts w:ascii="Times New Roman" w:cs="Times New Roman" w:eastAsia="Times New Roman" w:hAnsi="Times New Roman"/>
+          <w:b/>
+          <w:bCs/>
+          <w:sz w:val="24"/>
+          <w:szCs w:val="24"/>
+        </w:rPr>
+        <w:t xml:space="preserve">Step 3, validate the exact model version and configuration.</w:t>
+      </w:r>
+      <w:r>
+        <w:rPr>
+          <w:rFonts w:ascii="Times New Roman" w:cs="Times New Roman" w:eastAsia="Times New Roman" w:hAnsi="Times New Roman"/>
+          <w:sz w:val="24"/>
+          <w:szCs w:val="24"/>
+        </w:rPr>
+        <w:t xml:space="preserve"> Because errors are specific to model versions and persona architectures, a team should run a short validation battery on the configuration it will use, with human benchmarks for the relevant effect type, and require direction-validity for that effect type. The battery used here (nine items covering five effect types, with public human benchmarks and code) is a starting point. A new model version triggers revalidation.</w:t>
       </w:r>
     </w:p>
     <w:p>
@@ -9474,15 +9506,15 @@
           <w:sz w:val="24"/>
           <w:szCs w:val="24"/>
         </w:rPr>
-        <w:t xml:space="preserve">Step 3, validate the exact model version and configuration.</w:t>
-      </w:r>
-      <w:r>
-        <w:rPr>
-          <w:rFonts w:ascii="Times New Roman" w:cs="Times New Roman" w:eastAsia="Times New Roman" w:hAnsi="Times New Roman"/>
-          <w:sz w:val="24"/>
-          <w:szCs w:val="24"/>
-        </w:rPr>
-        <w:t xml:space="preserve"> Because errors are specific to model versions and persona architectures, a team should run a short validation battery on the configuration it will use, with human benchmarks for the relevant effect type, and require direction-validity for that effect type. The battery used here (nine items covering five effect types, public human benchmarks, and code) is a starting point. A new model version triggers revalidation. </w:t>
+        <w:t xml:space="preserve">Step 4, never rely on synthetic magnitudes.</w:t>
+      </w:r>
+      <w:r>
+        <w:rPr>
+          <w:rFonts w:ascii="Times New Roman" w:cs="Times New Roman" w:eastAsia="Times New Roman" w:hAnsi="Times New Roman"/>
+          <w:sz w:val="24"/>
+          <w:szCs w:val="24"/>
+        </w:rPr>
+        <w:t xml:space="preserve"> Magnitude was valid in few configurations, and reasoning effort moves bias in the wrong direction, so raising reasoning effort is not a debiasing tool. When effect size drives a decision, such as the expected lift of a new default, calibrate with a small human pilot. </w:t>
       </w:r>
       <w:r>
         <w:rPr>
@@ -9492,24 +9524,6 @@
           <w:sz w:val="24"/>
           <w:szCs w:val="24"/>
         </w:rPr>
-        <w:t xml:space="preserve">Step 4, never rely on synthetic magnitudes.</w:t>
-      </w:r>
-      <w:r>
-        <w:rPr>
-          <w:rFonts w:ascii="Times New Roman" w:cs="Times New Roman" w:eastAsia="Times New Roman" w:hAnsi="Times New Roman"/>
-          <w:sz w:val="24"/>
-          <w:szCs w:val="24"/>
-        </w:rPr>
-        <w:t xml:space="preserve"> Magnitude was valid in few configurations, and reasoning effort moves bias in the wrong direction, so raising reasoning effort is not a debiasing tool. When size matters, calibrate with a small human pilot. </w:t>
-      </w:r>
-      <w:r>
-        <w:rPr>
-          <w:rFonts w:ascii="Times New Roman" w:cs="Times New Roman" w:eastAsia="Times New Roman" w:hAnsi="Times New Roman"/>
-          <w:b/>
-          <w:bCs/>
-          <w:sz w:val="24"/>
-          <w:szCs w:val="24"/>
-        </w:rPr>
         <w:t xml:space="preserve">Step 5, for textual field treatments such as headlines, use the no-persona configuration and treat the output as a weak prior.</w:t>
       </w:r>
       <w:r>
@@ -9518,38 +9532,7 @@
           <w:sz w:val="24"/>
           <w:szCs w:val="24"/>
         </w:rPr>
-        <w:t xml:space="preserve"> Excess agreement of about nine points over chance and a slope of about a quarter indicate that predictions can order candidates only weakly.</w:t>
-      </w:r>
-    </w:p>
-    <w:p>
-      <w:pPr>
-        <w:spacing w:line="480"/>
-        <w:ind w:firstLine="720"/>
-      </w:pPr>
-      <w:r>
-        <w:rPr>
-          <w:rFonts w:ascii="Times New Roman" w:cs="Times New Roman" w:eastAsia="Times New Roman" w:hAnsi="Times New Roman"/>
-          <w:sz w:val="24"/>
-          <w:szCs w:val="24"/>
-        </w:rPr>
-        <w:t xml:space="preserve">The protocol also implies documentation duties. Synthetic evidence should be reported with the model identifier and access date, the persona architecture, the prompt template, the reasoning setting, the validation battery result, and the share of unusable responses. Without these, a synthetic result cannot be audited or reproduced, which matters for platform governance and for marketing research that uses synthetic respondents.</w:t>
-      </w:r>
-    </w:p>
-    <w:p>
-      <w:pPr>
-        <w:pStyle w:val="Heading1"/>
-        <w:keepNext/>
-        <w:spacing w:after="0" w:before="240" w:line="480"/>
-      </w:pPr>
-      <w:r>
-        <w:rPr>
-          <w:rFonts w:ascii="Times New Roman" w:cs="Times New Roman" w:eastAsia="Times New Roman" w:hAnsi="Times New Roman"/>
-          <w:b/>
-          <w:bCs/>
-          <w:sz w:val="24"/>
-          <w:szCs w:val="24"/>
-        </w:rPr>
-        <w:t xml:space="preserve">6. Discussion and Limitations</w:t>
+        <w:t xml:space="preserve"> Excess agreement of about nine points over chance and a calibration slope of about a quarter mean that predictions can order candidates only weakly.</w:t>
       </w:r>
     </w:p>
     <w:p>
@@ -9568,7 +9551,7 @@
           <w:sz w:val="24"/>
           <w:szCs w:val="24"/>
         </w:rPr>
-        <w:t xml:space="preserve">6.1 Implications for theory</w:t>
+        <w:t xml:space="preserve">5.1 Illustrations</w:t>
       </w:r>
     </w:p>
     <w:p>
@@ -9582,7 +9565,7 @@
           <w:sz w:val="24"/>
           <w:szCs w:val="24"/>
         </w:rPr>
-        <w:t xml:space="preserve">The confirmed results favor V3: recall of canonical paradigms, not mechanism, explains much of what looks like fidelity, and naming the theory amplifies that recall. They cannot separate V2 from V3 for defaults, because the only cost-based effect studied is confounded with paradigm familiarity, and a cleaner test would need a cost-based effect with canonical and novel paradigms and a cue-based effect with both. The cue-based predictions fared worse than the account anticipated. Cue-based effects were direction-valid but not reliably overshooting, and the lexical moderator did not predict field accuracy. This suggests that V1 is necessary but not sufficient, and that the relevant property is the specific cue processing of each model, not the cue type. Regarding V4, extended reasoning did not move agents toward human responding: it reduced factual errors while elaborating cues and raising bias. For marketing theory, this implies that capability gains in AI agents do not monotonically improve their usefulness as models of users, so validity must be established per use.</w:t>
+        <w:t xml:space="preserve">Three cases show how the protocol applies. A subscription firm considering pre-selected add-ons should not use synthetic consumers to forecast uptake, because the default effect is the cost-based effect on which twins failed and the sign flipped between a canonical and a novel paradigm. A retailer comparing three price-menu layouts with a decoy can use a validated configuration to screen out layouts whose predicted direction is clearly wrong, then test the survivors on customers. A publisher ranking headlines can run no-persona predictions as a cheap prior, but should not expect more than a modest improvement over chance and should keep the live test.</w:t>
       </w:r>
     </w:p>
     <w:p>
@@ -9601,7 +9584,7 @@
           <w:sz w:val="24"/>
           <w:szCs w:val="24"/>
         </w:rPr>
-        <w:t xml:space="preserve">6.2 Implications for practice and research methods</w:t>
+        <w:t xml:space="preserve">5.2 Cost, speed, and governance</w:t>
       </w:r>
     </w:p>
     <w:p>
@@ -9615,7 +9598,38 @@
           <w:sz w:val="24"/>
           <w:szCs w:val="24"/>
         </w:rPr>
-        <w:t xml:space="preserve">For platform teams, the main implication is to treat synthetic agents as a screening instrument for direction on cue-based changes, to avoid them for default and friction design, and to institutionalize revalidation when models change. For researchers who use synthetic respondents, the results argue for pre-specifying validation, reporting configuration details, and distinguishing canonical from novel paradigms. For governance, they caution against using twins to evaluate defaults and other choice architectures, where the failure we document is largest and most consequential for users.</w:t>
+        <w:t xml:space="preserve">Synthetic responses are cheap and fast. In our studies a call cost between a fraction of a cent and a few cents (for example, 9,000 calls in the confirmatory twin study cost about US$19), while participants in the human panel underlying our benchmarks were paid US$7 per survey wave. The savings are real only if the output is used for what it can do. Because the failures we document are largest for defaults, a design lever that shapes consumer welfare and attracts regulatory attention, firms should not evaluate default and friction design with synthetic evidence alone, and they should record the evidence they relied on.</w:t>
+      </w:r>
+    </w:p>
+    <w:p>
+      <w:pPr>
+        <w:spacing w:line="480"/>
+        <w:ind w:firstLine="720"/>
+      </w:pPr>
+      <w:r>
+        <w:rPr>
+          <w:rFonts w:ascii="Times New Roman" w:cs="Times New Roman" w:eastAsia="Times New Roman" w:hAnsi="Times New Roman"/>
+          <w:sz w:val="24"/>
+          <w:szCs w:val="24"/>
+        </w:rPr>
+        <w:t xml:space="preserve">The protocol also implies documentation duties. Synthetic evidence should be reported with the model identifier and access date, the persona architecture, the prompt template, the reasoning setting, the validation battery result, and the share of unusable responses. Without these, a synthetic result cannot be audited or reproduced, which matters for internal governance and for marketing research that uses synthetic respondents.</w:t>
+      </w:r>
+    </w:p>
+    <w:p>
+      <w:pPr>
+        <w:pStyle w:val="Heading1"/>
+        <w:keepNext/>
+        <w:spacing w:after="0" w:before="240" w:line="480"/>
+      </w:pPr>
+      <w:r>
+        <w:rPr>
+          <w:rFonts w:ascii="Times New Roman" w:cs="Times New Roman" w:eastAsia="Times New Roman" w:hAnsi="Times New Roman"/>
+          <w:b/>
+          <w:bCs/>
+          <w:sz w:val="24"/>
+          <w:szCs w:val="24"/>
+        </w:rPr>
+        <w:t xml:space="preserve">6. Discussion</w:t>
       </w:r>
     </w:p>
     <w:p>
@@ -9634,7 +9648,7 @@
           <w:sz w:val="24"/>
           <w:szCs w:val="24"/>
         </w:rPr>
-        <w:t xml:space="preserve">6.3 Limitations</w:t>
+        <w:t xml:space="preserve">6.1 Theoretical implications for consumer decision research</w:t>
       </w:r>
     </w:p>
     <w:p>
@@ -9648,7 +9662,21 @@
           <w:sz w:val="24"/>
           <w:szCs w:val="24"/>
         </w:rPr>
-        <w:t xml:space="preserve">Several limitations apply. Human benchmarks come from one US online panel and cover seven effects, so the validity map describes those effects and not behavior in general. The confirmatory twin studies used one draw per respondent and one temperature, and provider routing through an aggregator may vary across calls. Reasoning-effort settings are provider-specific, and one model could not disable reasoning. Results describe specific model versions in October 2026 and will date, which is why the protocol emphasizes revalidation instead of conclusions about models. The hallucination measure produced almost no variation, so the associated predictions are untested. The stability study was not pre-registered. The field archive is public and may be partly memorized. We discovered and corrected an indexing error in our multiplicity correction during analysis, which changed no verdict, and the correction is recorded in the repository. Finally, the account was built from exploratory data and only partly survived confirmation, so further tests with independent human data and additional effect types are needed.</w:t>
+        <w:t xml:space="preserve">The confirmed results favor V3: recall of canonical paradigms, not mechanism, explains much of what looks like fidelity, and naming the theory amplifies that recall. This matters for consumer research that uses LLMs to probe mechanisms, because an effect that appears in a textbook paradigm can disappear in a novel paradigm that tests the same mechanism. The findings cannot separate V2 from V3 for defaults, because the only cost-based effect studied is confounded with paradigm familiarity. A cleaner test would need a cost-based effect with both a canonical and a novel paradigm and a cue-based effect with both.</w:t>
+      </w:r>
+    </w:p>
+    <w:p>
+      <w:pPr>
+        <w:spacing w:line="480"/>
+        <w:ind w:firstLine="720"/>
+      </w:pPr>
+      <w:r>
+        <w:rPr>
+          <w:rFonts w:ascii="Times New Roman" w:cs="Times New Roman" w:eastAsia="Times New Roman" w:hAnsi="Times New Roman"/>
+          <w:sz w:val="24"/>
+          <w:szCs w:val="24"/>
+        </w:rPr>
+        <w:t xml:space="preserve">The cue-based predictions fared worse than the account anticipated. Cue-based effects were direction-valid but not reliably overshooting, and the lexical moderator did not predict field accuracy. This suggests that V1 is necessary but not sufficient, and that the relevant property is the specific cue processing of each model, not the cue type. Regarding V4, extended reasoning did not move agents toward human responding: it reduced factual errors while elaborating cues and raising bias. For marketing theory, the implication is that capability gains in AI agents do not monotonically improve their usefulness as models of consumers, so validity must be established for each use.</w:t>
       </w:r>
     </w:p>
     <w:p>
@@ -9667,7 +9695,7 @@
           <w:sz w:val="24"/>
           <w:szCs w:val="24"/>
         </w:rPr>
-        <w:t xml:space="preserve">6.4 Conclusion</w:t>
+        <w:t xml:space="preserve">6.2 Implications for marketing research practice</w:t>
       </w:r>
     </w:p>
     <w:p>
@@ -9681,7 +9709,87 @@
           <w:sz w:val="24"/>
           <w:szCs w:val="24"/>
         </w:rPr>
-        <w:t xml:space="preserve">Synthetic agents are neither valid nor invalid in general. In our data they carried information about the direction of cue-based effects, were unreliable about magnitudes and about cost-based effects such as defaults, and gave a weak, compressed signal in a field setting. Their errors belong to model versions and change as models change. For marketers and researchers, the practical answer to when a synthetic consumer can be trusted is a documented, version-specific validation against human benchmarks for the type of effect at hand, and not a general verdict about twins.</w:t>
+        <w:t xml:space="preserve">For researchers who use synthetic respondents, the results argue for pre-specifying validation, reporting configuration details, and distinguishing canonical from novel paradigms. They also favor using synthetic respondents for pretests and hypothesis generation, in line with existing guidelines (Sarstedt et al., 2024), and not for estimating effect sizes.</w:t>
+      </w:r>
+    </w:p>
+    <w:p>
+      <w:pPr>
+        <w:pStyle w:val="Heading2"/>
+        <w:keepNext/>
+        <w:spacing w:after="0" w:before="120" w:line="480"/>
+      </w:pPr>
+      <w:r>
+        <w:rPr>
+          <w:rFonts w:ascii="Times New Roman" w:cs="Times New Roman" w:eastAsia="Times New Roman" w:hAnsi="Times New Roman"/>
+          <w:b/>
+          <w:bCs/>
+          <w:i/>
+          <w:iCs/>
+          <w:sz w:val="24"/>
+          <w:szCs w:val="24"/>
+        </w:rPr>
+        <w:t xml:space="preserve">6.3 Limitations and future research</w:t>
+      </w:r>
+    </w:p>
+    <w:p>
+      <w:pPr>
+        <w:spacing w:line="480"/>
+        <w:ind w:firstLine="720"/>
+      </w:pPr>
+      <w:r>
+        <w:rPr>
+          <w:rFonts w:ascii="Times New Roman" w:cs="Times New Roman" w:eastAsia="Times New Roman" w:hAnsi="Times New Roman"/>
+          <w:sz w:val="24"/>
+          <w:szCs w:val="24"/>
+        </w:rPr>
+        <w:t xml:space="preserve">Several limitations apply. Human benchmarks come from one US online panel and cover seven effects, so the validity map describes those effects and not consumer behavior in general. The confirmatory twin studies used one draw per respondent and one temperature, and provider routing through an aggregator may vary across calls. Reasoning-effort settings are provider-specific, and one model could not disable reasoning. Results describe specific model versions in October 2026 and will date, which is why the protocol emphasizes revalidation instead of conclusions about models. The hallucination measure produced almost no variation, so the associated predictions are untested. The stability study was not pre-registered. The field archive is public and may be partly memorized. We discovered and corrected an indexing error in our multiplicity correction during analysis, which changed no verdict, and the correction is recorded in the supplementary files. Finally, the account was built from exploratory data and only partly survived confirmation.</w:t>
+      </w:r>
+    </w:p>
+    <w:p>
+      <w:pPr>
+        <w:spacing w:line="480"/>
+        <w:ind w:firstLine="720"/>
+      </w:pPr>
+      <w:r>
+        <w:rPr>
+          <w:rFonts w:ascii="Times New Roman" w:cs="Times New Roman" w:eastAsia="Times New Roman" w:hAnsi="Times New Roman"/>
+          <w:sz w:val="24"/>
+          <w:szCs w:val="24"/>
+        </w:rPr>
+        <w:t xml:space="preserve">Future research should extend the validity map to further consumer effects such as choice overload, mental accounting, and price promotions; test cost-based and cue-based effects in both canonical and novel paradigms; replicate with human samples from other countries and with firm-run field experiments in which synthetic predictions are registered before the test; study multimodal stimuli such as images and video, which our text-only agents did not see; and evaluate calibration methods that combine small human samples with synthetic outputs (Persson et al., 2026; Wang et al., 2026).</w:t>
+      </w:r>
+    </w:p>
+    <w:p>
+      <w:pPr>
+        <w:pStyle w:val="Heading2"/>
+        <w:keepNext/>
+        <w:spacing w:after="0" w:before="120" w:line="480"/>
+      </w:pPr>
+      <w:r>
+        <w:rPr>
+          <w:rFonts w:ascii="Times New Roman" w:cs="Times New Roman" w:eastAsia="Times New Roman" w:hAnsi="Times New Roman"/>
+          <w:b/>
+          <w:bCs/>
+          <w:i/>
+          <w:iCs/>
+          <w:sz w:val="24"/>
+          <w:szCs w:val="24"/>
+        </w:rPr>
+        <w:t xml:space="preserve">6.4 Conclusion</w:t>
+      </w:r>
+    </w:p>
+    <w:p>
+      <w:pPr>
+        <w:spacing w:line="480"/>
+        <w:ind w:firstLine="720"/>
+      </w:pPr>
+      <w:r>
+        <w:rPr>
+          <w:rFonts w:ascii="Times New Roman" w:cs="Times New Roman" w:eastAsia="Times New Roman" w:hAnsi="Times New Roman"/>
+          <w:sz w:val="24"/>
+          <w:szCs w:val="24"/>
+        </w:rPr>
+        <w:t xml:space="preserve">Synthetic consumers are neither valid nor invalid in general. In our data they carried information about the direction of cue-based effects, were unreliable about magnitudes and about cost-based effects such as defaults, and gave a weak, compressed signal in a field setting. Their errors belong to model versions and change as models change. For marketers and researchers, the practical answer to when a synthetic consumer can be trusted is a documented, version-specific validation against human benchmarks for the type of effect at hand, and not a general verdict about twins.</w:t>
       </w:r>
     </w:p>
     <w:p>
@@ -10279,6 +10387,70 @@
           <w:szCs w:val="24"/>
         </w:rPr>
         <w:t xml:space="preserve"> (arXiv:2606.17165). arXiv.</w:t>
+      </w:r>
+    </w:p>
+    <w:p>
+      <w:pPr>
+        <w:spacing w:line="480"/>
+        <w:ind w:left="720" w:hanging="720"/>
+      </w:pPr>
+      <w:r>
+        <w:rPr>
+          <w:rFonts w:ascii="Times New Roman" w:cs="Times New Roman" w:eastAsia="Times New Roman" w:hAnsi="Times New Roman"/>
+          <w:sz w:val="24"/>
+          <w:szCs w:val="24"/>
+        </w:rPr>
+        <w:t xml:space="preserve">Sarstedt, M., Adler, S. J., Rau, L., &amp; Schmitz, B. (2024). Using large language models to generate silicon samples in consumer and marketing research: Challenges, opportunities, and guidelines. </w:t>
+      </w:r>
+      <w:r>
+        <w:rPr>
+          <w:rFonts w:ascii="Times New Roman" w:cs="Times New Roman" w:eastAsia="Times New Roman" w:hAnsi="Times New Roman"/>
+          <w:i/>
+          <w:iCs/>
+          <w:sz w:val="24"/>
+          <w:szCs w:val="24"/>
+        </w:rPr>
+        <w:t xml:space="preserve">Psychology &amp; Marketing, 41</w:t>
+      </w:r>
+      <w:r>
+        <w:rPr>
+          <w:rFonts w:ascii="Times New Roman" w:cs="Times New Roman" w:eastAsia="Times New Roman" w:hAnsi="Times New Roman"/>
+          <w:sz w:val="24"/>
+          <w:szCs w:val="24"/>
+        </w:rPr>
+        <w:t xml:space="preserve">(6), 1254–1270. https://doi.org/10.1002/mar.21982</w:t>
+      </w:r>
+    </w:p>
+    <w:p>
+      <w:pPr>
+        <w:spacing w:line="480"/>
+        <w:ind w:left="720" w:hanging="720"/>
+      </w:pPr>
+      <w:r>
+        <w:rPr>
+          <w:rFonts w:ascii="Times New Roman" w:cs="Times New Roman" w:eastAsia="Times New Roman" w:hAnsi="Times New Roman"/>
+          <w:sz w:val="24"/>
+          <w:szCs w:val="24"/>
+        </w:rPr>
+        <w:t xml:space="preserve">Stromberg, M., Moe, W. W., Reutterer, T., &amp; Schweidel, D. A. (2025). </w:t>
+      </w:r>
+      <w:r>
+        <w:rPr>
+          <w:rFonts w:ascii="Times New Roman" w:cs="Times New Roman" w:eastAsia="Times New Roman" w:hAnsi="Times New Roman"/>
+          <w:i/>
+          <w:iCs/>
+          <w:sz w:val="24"/>
+          <w:szCs w:val="24"/>
+        </w:rPr>
+        <w:t xml:space="preserve">Blind spots in broad strokes: Caveats for the use of LLMs in marketing research</w:t>
+      </w:r>
+      <w:r>
+        <w:rPr>
+          <w:rFonts w:ascii="Times New Roman" w:cs="Times New Roman" w:eastAsia="Times New Roman" w:hAnsi="Times New Roman"/>
+          <w:sz w:val="24"/>
+          <w:szCs w:val="24"/>
+        </w:rPr>
+        <w:t xml:space="preserve">. SSRN. https://doi.org/10.2139/ssrn.5145114</w:t>
       </w:r>
     </w:p>
     <w:p>

</xml_diff>